<commit_message>
feat(saff-study): publish specification and test suite v1.7
</commit_message>
<xml_diff>
--- a/output/docx/CRUDCliente.docx
+++ b/output/docx/CRUDCliente.docx
@@ -197,7 +197,7 @@
               <w:rPr>
                 <w:sz w:val="18"/>
               </w:rPr>
-              <w:t>superAdmin: seleciona opção 'Customers' no menu Settings</w:t>
+              <w:t>superAdmin: seleciona opcao 'Customers' no menu Settings</w:t>
             </w:r>
           </w:p>
         </w:tc>
@@ -239,7 +239,7 @@
               <w:rPr>
                 <w:sz w:val="18"/>
               </w:rPr>
-              <w:t>SYSTEM exibe página com campos de cadastro de novo cliente</w:t>
+              <w:t>SYSTEM exibe pagina com campos de cadastro de novo cliente</w:t>
             </w:r>
           </w:p>
         </w:tc>
@@ -261,17 +261,17 @@
               <w:rPr>
                 <w:sz w:val="18"/>
               </w:rPr>
-              <w:t xml:space="preserve">superAdmin: preenche corretamente os campos 'Name', 'Key File' e 'Country' e pressiona o botão 'Create' </w:t>
-            </w:r>
-          </w:p>
-        </w:tc>
-        <w:tc>
-          <w:p>
-            <w:r>
-              <w:rPr>
-                <w:sz w:val="18"/>
-              </w:rPr>
-              <w:t>SYSTEM exibe página com dados do novo cliente e mensagem que um novo cliente foi adicionado</w:t>
+              <w:t xml:space="preserve">superAdmin: preenche corretamente os campos 'Name', 'Key File' e 'Country' e pressiona o botao 'Create' </w:t>
+            </w:r>
+          </w:p>
+        </w:tc>
+        <w:tc>
+          <w:p>
+            <w:r>
+              <w:rPr>
+                <w:sz w:val="18"/>
+              </w:rPr>
+              <w:t>SYSTEM exibe pagina com dados do novo cliente e mensagem que um novo cliente foi adicionado</w:t>
             </w:r>
           </w:p>
         </w:tc>
@@ -293,7 +293,7 @@
               <w:rPr>
                 <w:sz w:val="18"/>
               </w:rPr>
-              <w:t>superAdmin: seleciona opção 'Customers' no menu Settings</w:t>
+              <w:t>superAdmin: seleciona opcao 'Customers' no menu Settings</w:t>
             </w:r>
           </w:p>
         </w:tc>
@@ -357,7 +357,7 @@
               <w:rPr>
                 <w:sz w:val="18"/>
               </w:rPr>
-              <w:t>superAdmin: clica no botão 'Cancel'</w:t>
+              <w:t>superAdmin: clica no botao 'Cancel'</w:t>
             </w:r>
           </w:p>
         </w:tc>
@@ -388,7 +388,7 @@
           <w:sz w:val="24"/>
           <w:color w:val="2B6CB0"/>
         </w:rPr>
-        <w:t>[TC2] Alternative Flow 1: Cancela criação</w:t>
+        <w:t>[TC2] Alternative Flow 1: Campo fora da formatacao esperada, e.g., 'ddd' para 'Key File'</w:t>
       </w:r>
     </w:p>
     <w:p>
@@ -515,7 +515,7 @@
               <w:rPr>
                 <w:sz w:val="18"/>
               </w:rPr>
-              <w:t>superAdmin: seleciona opção 'Customers' no menu Settings</w:t>
+              <w:t>superAdmin: seleciona opcao 'Customers' no menu Settings</w:t>
             </w:r>
           </w:p>
         </w:tc>
@@ -557,7 +557,7 @@
               <w:rPr>
                 <w:sz w:val="18"/>
               </w:rPr>
-              <w:t>SYSTEM exibe página com campos de cadastro de novo cliente</w:t>
+              <w:t>SYSTEM exibe pagina com campos de cadastro de novo cliente</w:t>
             </w:r>
           </w:p>
         </w:tc>
@@ -579,7 +579,71 @@
               <w:rPr>
                 <w:sz w:val="18"/>
               </w:rPr>
-              <w:t>superAdmin: Cancela criação</w:t>
+              <w:t xml:space="preserve">superAdmin: preenche incorretamente os campos 'Name', 'Key File' e/ou 'Country' e pressiona o botão 'Create' </w:t>
+            </w:r>
+          </w:p>
+        </w:tc>
+        <w:tc>
+          <w:p>
+            <w:r>
+              <w:rPr>
+                <w:sz w:val="18"/>
+              </w:rPr>
+              <w:t>SYSTEM exibe mensagem informando que os dados nao correspondem a formatação esperada</w:t>
+            </w:r>
+          </w:p>
+        </w:tc>
+      </w:tr>
+      <w:tr>
+        <w:tc>
+          <w:p>
+            <w:r>
+              <w:rPr>
+                <w:sz w:val="18"/>
+              </w:rPr>
+              <w:t>4</w:t>
+            </w:r>
+          </w:p>
+        </w:tc>
+        <w:tc>
+          <w:p>
+            <w:r>
+              <w:rPr>
+                <w:sz w:val="18"/>
+              </w:rPr>
+              <w:t xml:space="preserve">superAdmin: preenche corretamente os campos 'Name', 'Key File' e 'Country' e pressiona o botao 'Create' </w:t>
+            </w:r>
+          </w:p>
+        </w:tc>
+        <w:tc>
+          <w:p>
+            <w:r>
+              <w:rPr>
+                <w:sz w:val="18"/>
+              </w:rPr>
+              <w:t>SYSTEM exibe pagina com dados do novo cliente e mensagem que um novo cliente foi adicionado</w:t>
+            </w:r>
+          </w:p>
+        </w:tc>
+      </w:tr>
+      <w:tr>
+        <w:tc>
+          <w:p>
+            <w:r>
+              <w:rPr>
+                <w:sz w:val="18"/>
+              </w:rPr>
+              <w:t>5</w:t>
+            </w:r>
+          </w:p>
+        </w:tc>
+        <w:tc>
+          <w:p>
+            <w:r>
+              <w:rPr>
+                <w:sz w:val="18"/>
+              </w:rPr>
+              <w:t>superAdmin: seleciona opcao 'Customers' no menu Settings</w:t>
             </w:r>
           </w:p>
         </w:tc>
@@ -601,70 +665,6 @@
               <w:rPr>
                 <w:sz w:val="18"/>
               </w:rPr>
-              <w:t>4</w:t>
-            </w:r>
-          </w:p>
-        </w:tc>
-        <w:tc>
-          <w:p>
-            <w:r>
-              <w:rPr>
-                <w:sz w:val="18"/>
-              </w:rPr>
-              <w:t>superAdmin: seleciona o botão 'Create Customer'</w:t>
-            </w:r>
-          </w:p>
-        </w:tc>
-        <w:tc>
-          <w:p>
-            <w:r>
-              <w:rPr>
-                <w:sz w:val="18"/>
-              </w:rPr>
-              <w:t>SYSTEM exibe página com campos de cadastro de novo cliente</w:t>
-            </w:r>
-          </w:p>
-        </w:tc>
-      </w:tr>
-      <w:tr>
-        <w:tc>
-          <w:p>
-            <w:r>
-              <w:rPr>
-                <w:sz w:val="18"/>
-              </w:rPr>
-              <w:t>5</w:t>
-            </w:r>
-          </w:p>
-        </w:tc>
-        <w:tc>
-          <w:p>
-            <w:r>
-              <w:rPr>
-                <w:sz w:val="18"/>
-              </w:rPr>
-              <w:t xml:space="preserve">superAdmin: preenche corretamente os campos 'Name', 'Key File' e 'Country' e pressiona o botão 'Create' </w:t>
-            </w:r>
-          </w:p>
-        </w:tc>
-        <w:tc>
-          <w:p>
-            <w:r>
-              <w:rPr>
-                <w:sz w:val="18"/>
-              </w:rPr>
-              <w:t>SYSTEM exibe página com dados do novo cliente e mensagem que um novo cliente foi adicionado</w:t>
-            </w:r>
-          </w:p>
-        </w:tc>
-      </w:tr>
-      <w:tr>
-        <w:tc>
-          <w:p>
-            <w:r>
-              <w:rPr>
-                <w:sz w:val="18"/>
-              </w:rPr>
               <w:t>6</w:t>
             </w:r>
           </w:p>
@@ -675,17 +675,17 @@
               <w:rPr>
                 <w:sz w:val="18"/>
               </w:rPr>
-              <w:t>superAdmin: seleciona opção 'Customers' no menu Settings</w:t>
-            </w:r>
-          </w:p>
-        </w:tc>
-        <w:tc>
-          <w:p>
-            <w:r>
-              <w:rPr>
-                <w:sz w:val="18"/>
-              </w:rPr>
-              <w:t>SYSTEM exibe lista de clientes</w:t>
+              <w:t>superAdmin: clica no nome de um cliente</w:t>
+            </w:r>
+          </w:p>
+        </w:tc>
+        <w:tc>
+          <w:p>
+            <w:r>
+              <w:rPr>
+                <w:sz w:val="18"/>
+              </w:rPr>
+              <w:t>SYSTEM exibe dados do cliente</w:t>
             </w:r>
           </w:p>
         </w:tc>
@@ -707,39 +707,7 @@
               <w:rPr>
                 <w:sz w:val="18"/>
               </w:rPr>
-              <w:t>superAdmin: clica no nome de um cliente</w:t>
-            </w:r>
-          </w:p>
-        </w:tc>
-        <w:tc>
-          <w:p>
-            <w:r>
-              <w:rPr>
-                <w:sz w:val="18"/>
-              </w:rPr>
-              <w:t>SYSTEM exibe dados do cliente</w:t>
-            </w:r>
-          </w:p>
-        </w:tc>
-      </w:tr>
-      <w:tr>
-        <w:tc>
-          <w:p>
-            <w:r>
-              <w:rPr>
-                <w:sz w:val="18"/>
-              </w:rPr>
-              <w:t>8</w:t>
-            </w:r>
-          </w:p>
-        </w:tc>
-        <w:tc>
-          <w:p>
-            <w:r>
-              <w:rPr>
-                <w:sz w:val="18"/>
-              </w:rPr>
-              <w:t>superAdmin: clica no botão 'Cancel'</w:t>
+              <w:t>superAdmin: clica no botao 'Cancel'</w:t>
             </w:r>
           </w:p>
         </w:tc>
@@ -770,7 +738,7 @@
           <w:sz w:val="24"/>
           <w:color w:val="2B6CB0"/>
         </w:rPr>
-        <w:t>[TC3] Alternative Flow 2: Edita dados</w:t>
+        <w:t>[TC3] Alternative Flow 2: Cancela criacao</w:t>
       </w:r>
     </w:p>
     <w:p>
@@ -897,7 +865,7 @@
               <w:rPr>
                 <w:sz w:val="18"/>
               </w:rPr>
-              <w:t>superAdmin: seleciona opção 'Customers' no menu Settings</w:t>
+              <w:t>superAdmin: seleciona opcao 'Customers' no menu Settings</w:t>
             </w:r>
           </w:p>
         </w:tc>
@@ -939,7 +907,7 @@
               <w:rPr>
                 <w:sz w:val="18"/>
               </w:rPr>
-              <w:t>SYSTEM exibe página com campos de cadastro de novo cliente</w:t>
+              <w:t>SYSTEM exibe pagina com campos de cadastro de novo cliente</w:t>
             </w:r>
           </w:p>
         </w:tc>
@@ -961,17 +929,17 @@
               <w:rPr>
                 <w:sz w:val="18"/>
               </w:rPr>
-              <w:t xml:space="preserve">superAdmin: preenche corretamente os campos 'Name', 'Key File' e 'Country' e pressiona o botão 'Create' </w:t>
-            </w:r>
-          </w:p>
-        </w:tc>
-        <w:tc>
-          <w:p>
-            <w:r>
-              <w:rPr>
-                <w:sz w:val="18"/>
-              </w:rPr>
-              <w:t>SYSTEM exibe página com dados do novo cliente e mensagem que um novo cliente foi adicionado</w:t>
+              <w:t>superAdmin: Cancela criacao</w:t>
+            </w:r>
+          </w:p>
+        </w:tc>
+        <w:tc>
+          <w:p>
+            <w:r>
+              <w:rPr>
+                <w:sz w:val="18"/>
+              </w:rPr>
+              <w:t>SYSTEM exibe lista de clientes</w:t>
             </w:r>
           </w:p>
         </w:tc>
@@ -993,7 +961,71 @@
               <w:rPr>
                 <w:sz w:val="18"/>
               </w:rPr>
-              <w:t>superAdmin: seleciona opção 'Customers' no menu Settings</w:t>
+              <w:t>superAdmin: seleciona o botão 'Create Customer'</w:t>
+            </w:r>
+          </w:p>
+        </w:tc>
+        <w:tc>
+          <w:p>
+            <w:r>
+              <w:rPr>
+                <w:sz w:val="18"/>
+              </w:rPr>
+              <w:t>SYSTEM exibe pagina com campos de cadastro de novo cliente</w:t>
+            </w:r>
+          </w:p>
+        </w:tc>
+      </w:tr>
+      <w:tr>
+        <w:tc>
+          <w:p>
+            <w:r>
+              <w:rPr>
+                <w:sz w:val="18"/>
+              </w:rPr>
+              <w:t>5</w:t>
+            </w:r>
+          </w:p>
+        </w:tc>
+        <w:tc>
+          <w:p>
+            <w:r>
+              <w:rPr>
+                <w:sz w:val="18"/>
+              </w:rPr>
+              <w:t xml:space="preserve">superAdmin: preenche corretamente os campos 'Name', 'Key File' e 'Country' e pressiona o botao 'Create' </w:t>
+            </w:r>
+          </w:p>
+        </w:tc>
+        <w:tc>
+          <w:p>
+            <w:r>
+              <w:rPr>
+                <w:sz w:val="18"/>
+              </w:rPr>
+              <w:t>SYSTEM exibe pagina com dados do novo cliente e mensagem que um novo cliente foi adicionado</w:t>
+            </w:r>
+          </w:p>
+        </w:tc>
+      </w:tr>
+      <w:tr>
+        <w:tc>
+          <w:p>
+            <w:r>
+              <w:rPr>
+                <w:sz w:val="18"/>
+              </w:rPr>
+              <w:t>6</w:t>
+            </w:r>
+          </w:p>
+        </w:tc>
+        <w:tc>
+          <w:p>
+            <w:r>
+              <w:rPr>
+                <w:sz w:val="18"/>
+              </w:rPr>
+              <w:t>superAdmin: seleciona opcao 'Customers' no menu Settings</w:t>
             </w:r>
           </w:p>
         </w:tc>
@@ -1015,7 +1047,7 @@
               <w:rPr>
                 <w:sz w:val="18"/>
               </w:rPr>
-              <w:t>5</w:t>
+              <w:t>7</w:t>
             </w:r>
           </w:p>
         </w:tc>
@@ -1047,70 +1079,6 @@
               <w:rPr>
                 <w:sz w:val="18"/>
               </w:rPr>
-              <w:t>6</w:t>
-            </w:r>
-          </w:p>
-        </w:tc>
-        <w:tc>
-          <w:p>
-            <w:r>
-              <w:rPr>
-                <w:sz w:val="18"/>
-              </w:rPr>
-              <w:t>superAdmin: clica no botão 'Edit'</w:t>
-            </w:r>
-          </w:p>
-        </w:tc>
-        <w:tc>
-          <w:p>
-            <w:r>
-              <w:rPr>
-                <w:sz w:val="18"/>
-              </w:rPr>
-              <w:t>SYSTEM exibe campos do cliente com valores atuais que podem ser editados</w:t>
-            </w:r>
-          </w:p>
-        </w:tc>
-      </w:tr>
-      <w:tr>
-        <w:tc>
-          <w:p>
-            <w:r>
-              <w:rPr>
-                <w:sz w:val="18"/>
-              </w:rPr>
-              <w:t>7</w:t>
-            </w:r>
-          </w:p>
-        </w:tc>
-        <w:tc>
-          <w:p>
-            <w:r>
-              <w:rPr>
-                <w:sz w:val="18"/>
-              </w:rPr>
-              <w:t>superAdmin: preenche os novos valores e pressiona o botão 'Update</w:t>
-            </w:r>
-          </w:p>
-        </w:tc>
-        <w:tc>
-          <w:p>
-            <w:r>
-              <w:rPr>
-                <w:sz w:val="18"/>
-              </w:rPr>
-              <w:t>SYSTEM exibe dados do cliente</w:t>
-            </w:r>
-          </w:p>
-        </w:tc>
-      </w:tr>
-      <w:tr>
-        <w:tc>
-          <w:p>
-            <w:r>
-              <w:rPr>
-                <w:sz w:val="18"/>
-              </w:rPr>
               <w:t>8</w:t>
             </w:r>
           </w:p>
@@ -1121,7 +1089,7 @@
               <w:rPr>
                 <w:sz w:val="18"/>
               </w:rPr>
-              <w:t>superAdmin: clica no botão 'Cancel'</w:t>
+              <w:t>superAdmin: clica no botao 'Cancel'</w:t>
             </w:r>
           </w:p>
         </w:tc>
@@ -1152,7 +1120,7 @@
           <w:sz w:val="24"/>
           <w:color w:val="2B6CB0"/>
         </w:rPr>
-        <w:t>[TC4] Alternative Flow 3: Deleta cliente</w:t>
+        <w:t>[TC4] Alternative Flow 3: Edita dados</w:t>
       </w:r>
     </w:p>
     <w:p>
@@ -1279,7 +1247,7 @@
               <w:rPr>
                 <w:sz w:val="18"/>
               </w:rPr>
-              <w:t>superAdmin: seleciona opção 'Customers' no menu Settings</w:t>
+              <w:t>superAdmin: seleciona opcao 'Customers' no menu Settings</w:t>
             </w:r>
           </w:p>
         </w:tc>
@@ -1321,7 +1289,7 @@
               <w:rPr>
                 <w:sz w:val="18"/>
               </w:rPr>
-              <w:t>SYSTEM exibe página com campos de cadastro de novo cliente</w:t>
+              <w:t>SYSTEM exibe pagina com campos de cadastro de novo cliente</w:t>
             </w:r>
           </w:p>
         </w:tc>
@@ -1343,17 +1311,17 @@
               <w:rPr>
                 <w:sz w:val="18"/>
               </w:rPr>
-              <w:t xml:space="preserve">superAdmin: preenche corretamente os campos 'Name', 'Key File' e 'Country' e pressiona o botão 'Create' </w:t>
-            </w:r>
-          </w:p>
-        </w:tc>
-        <w:tc>
-          <w:p>
-            <w:r>
-              <w:rPr>
-                <w:sz w:val="18"/>
-              </w:rPr>
-              <w:t>SYSTEM exibe página com dados do novo cliente e mensagem que um novo cliente foi adicionado</w:t>
+              <w:t xml:space="preserve">superAdmin: preenche corretamente os campos 'Name', 'Key File' e 'Country' e pressiona o botao 'Create' </w:t>
+            </w:r>
+          </w:p>
+        </w:tc>
+        <w:tc>
+          <w:p>
+            <w:r>
+              <w:rPr>
+                <w:sz w:val="18"/>
+              </w:rPr>
+              <w:t>SYSTEM exibe pagina com dados do novo cliente e mensagem que um novo cliente foi adicionado</w:t>
             </w:r>
           </w:p>
         </w:tc>
@@ -1375,7 +1343,7 @@
               <w:rPr>
                 <w:sz w:val="18"/>
               </w:rPr>
-              <w:t>superAdmin: seleciona opção 'Customers' no menu Settings</w:t>
+              <w:t>superAdmin: seleciona opcao 'Customers' no menu Settings</w:t>
             </w:r>
           </w:p>
         </w:tc>
@@ -1439,17 +1407,17 @@
               <w:rPr>
                 <w:sz w:val="18"/>
               </w:rPr>
-              <w:t>superAdmin: clica no botão 'Delete'</w:t>
-            </w:r>
-          </w:p>
-        </w:tc>
-        <w:tc>
-          <w:p>
-            <w:r>
-              <w:rPr>
-                <w:sz w:val="18"/>
-              </w:rPr>
-              <w:t>SYSTEM exibe mensagem solicitando confirmação</w:t>
+              <w:t>superAdmin: clica no botao 'Edit'</w:t>
+            </w:r>
+          </w:p>
+        </w:tc>
+        <w:tc>
+          <w:p>
+            <w:r>
+              <w:rPr>
+                <w:sz w:val="18"/>
+              </w:rPr>
+              <w:t>SYSTEM exibe campos do cliente com valores atuais que podem ser editados</w:t>
             </w:r>
           </w:p>
         </w:tc>
@@ -1471,7 +1439,7 @@
               <w:rPr>
                 <w:sz w:val="18"/>
               </w:rPr>
-              <w:t>superAdmin: pressiona o botão OK</w:t>
+              <w:t>superAdmin: preenche os novos valores e pressiona o botao 'Update</w:t>
             </w:r>
           </w:p>
         </w:tc>
@@ -1513,7 +1481,7 @@
               <w:rPr>
                 <w:sz w:val="18"/>
               </w:rPr>
-              <w:t>SYSTEM exibe página com campos de cadastro de novo cliente</w:t>
+              <w:t>SYSTEM exibe pagina com campos de cadastro de novo cliente</w:t>
             </w:r>
           </w:p>
         </w:tc>
@@ -1535,17 +1503,17 @@
               <w:rPr>
                 <w:sz w:val="18"/>
               </w:rPr>
-              <w:t xml:space="preserve">superAdmin: preenche corretamente os campos 'Name', 'Key File' e 'Country' e pressiona o botão 'Create' </w:t>
-            </w:r>
-          </w:p>
-        </w:tc>
-        <w:tc>
-          <w:p>
-            <w:r>
-              <w:rPr>
-                <w:sz w:val="18"/>
-              </w:rPr>
-              <w:t>SYSTEM exibe página com dados do novo cliente e mensagem que um novo cliente foi adicionado</w:t>
+              <w:t xml:space="preserve">superAdmin: preenche corretamente os campos 'Name', 'Key File' e 'Country' e pressiona o botao 'Create' </w:t>
+            </w:r>
+          </w:p>
+        </w:tc>
+        <w:tc>
+          <w:p>
+            <w:r>
+              <w:rPr>
+                <w:sz w:val="18"/>
+              </w:rPr>
+              <w:t>SYSTEM exibe pagina com dados do novo cliente e mensagem que um novo cliente foi adicionado</w:t>
             </w:r>
           </w:p>
         </w:tc>
@@ -1567,7 +1535,7 @@
               <w:rPr>
                 <w:sz w:val="18"/>
               </w:rPr>
-              <w:t>superAdmin: seleciona opção 'Customers' no menu Settings</w:t>
+              <w:t>superAdmin: seleciona opcao 'Customers' no menu Settings</w:t>
             </w:r>
           </w:p>
         </w:tc>
@@ -1631,7 +1599,517 @@
               <w:rPr>
                 <w:sz w:val="18"/>
               </w:rPr>
-              <w:t>superAdmin: clica no botão 'Cancel'</w:t>
+              <w:t>superAdmin: clica no botao 'Cancel'</w:t>
+            </w:r>
+          </w:p>
+        </w:tc>
+        <w:tc>
+          <w:p>
+            <w:r>
+              <w:rPr>
+                <w:sz w:val="18"/>
+              </w:rPr>
+              <w:t>SYSTEM retorna a lista de clientes</w:t>
+            </w:r>
+          </w:p>
+        </w:tc>
+      </w:tr>
+    </w:tbl>
+    <w:p>
+      <w:r>
+        <w:br/>
+      </w:r>
+    </w:p>
+    <w:p>
+      <w:pPr>
+        <w:spacing w:before="180" w:after="60"/>
+      </w:pPr>
+      <w:r>
+        <w:rPr>
+          <w:b w:val="on"/>
+          <w:sz w:val="24"/>
+          <w:color w:val="2B6CB0"/>
+        </w:rPr>
+        <w:t>[TC5] Alternative Flow 4: Deleta cliente</w:t>
+      </w:r>
+    </w:p>
+    <w:p>
+      <w:pPr>
+        <w:spacing w:after="40"/>
+      </w:pPr>
+      <w:r>
+        <w:rPr>
+          <w:b w:val="on"/>
+          <w:sz w:val="20"/>
+        </w:rPr>
+        <w:t xml:space="preserve">Preconditions: </w:t>
+      </w:r>
+      <w:r>
+        <w:rPr>
+          <w:sz w:val="20"/>
+        </w:rPr>
+        <w:t>Estar logado como super administrador</w:t>
+      </w:r>
+    </w:p>
+    <w:p>
+      <w:pPr>
+        <w:spacing w:after="40"/>
+      </w:pPr>
+      <w:r>
+        <w:rPr>
+          <w:b w:val="on"/>
+          <w:sz w:val="20"/>
+        </w:rPr>
+        <w:t xml:space="preserve">Postconditions: </w:t>
+      </w:r>
+      <w:r>
+        <w:rPr>
+          <w:sz w:val="20"/>
+        </w:rPr>
+        <w:t/>
+      </w:r>
+    </w:p>
+    <w:tbl>
+      <w:tblPr>
+        <w:tblW w:w="5000" w:type="pct"/>
+        <w:tblBorders>
+          <w:top w:val="single"/>
+          <w:left w:val="single"/>
+          <w:bottom w:val="single"/>
+          <w:right w:val="single"/>
+          <w:insideH w:val="single"/>
+          <w:insideV w:val="single"/>
+        </w:tblBorders>
+      </w:tblPr>
+      <w:tr>
+        <w:tc>
+          <w:tcPr>
+            <w:tcW w:w="1200" w:type="dxa"/>
+            <w:shd w:color="auto" w:val="clear" w:fill="2B6CB0"/>
+          </w:tcPr>
+          <w:p>
+            <w:pPr>
+              <w:jc w:val="left"/>
+            </w:pPr>
+            <w:r>
+              <w:rPr>
+                <w:b w:val="on"/>
+                <w:sz w:val="20"/>
+                <w:color w:val="FFFFFF"/>
+              </w:rPr>
+              <w:t>Step #</w:t>
+            </w:r>
+          </w:p>
+        </w:tc>
+        <w:tc>
+          <w:tcPr>
+            <w:tcW w:w="4500" w:type="dxa"/>
+            <w:shd w:color="auto" w:val="clear" w:fill="2B6CB0"/>
+          </w:tcPr>
+          <w:p>
+            <w:pPr>
+              <w:jc w:val="left"/>
+            </w:pPr>
+            <w:r>
+              <w:rPr>
+                <w:b w:val="on"/>
+                <w:sz w:val="20"/>
+                <w:color w:val="FFFFFF"/>
+              </w:rPr>
+              <w:t>Actor Action</w:t>
+            </w:r>
+          </w:p>
+        </w:tc>
+        <w:tc>
+          <w:tcPr>
+            <w:tcW w:w="4500" w:type="dxa"/>
+            <w:shd w:color="auto" w:val="clear" w:fill="2B6CB0"/>
+          </w:tcPr>
+          <w:p>
+            <w:pPr>
+              <w:jc w:val="left"/>
+            </w:pPr>
+            <w:r>
+              <w:rPr>
+                <w:b w:val="on"/>
+                <w:sz w:val="20"/>
+                <w:color w:val="FFFFFF"/>
+              </w:rPr>
+              <w:t>Expected Result (System)</w:t>
+            </w:r>
+          </w:p>
+        </w:tc>
+      </w:tr>
+      <w:tr>
+        <w:tc>
+          <w:p>
+            <w:r>
+              <w:rPr>
+                <w:sz w:val="18"/>
+              </w:rPr>
+              <w:t>1</w:t>
+            </w:r>
+          </w:p>
+        </w:tc>
+        <w:tc>
+          <w:p>
+            <w:r>
+              <w:rPr>
+                <w:sz w:val="18"/>
+              </w:rPr>
+              <w:t>superAdmin: seleciona opcao 'Customers' no menu Settings</w:t>
+            </w:r>
+          </w:p>
+        </w:tc>
+        <w:tc>
+          <w:p>
+            <w:r>
+              <w:rPr>
+                <w:sz w:val="18"/>
+              </w:rPr>
+              <w:t>SYSTEM exibe lista de clientes</w:t>
+            </w:r>
+          </w:p>
+        </w:tc>
+      </w:tr>
+      <w:tr>
+        <w:tc>
+          <w:p>
+            <w:r>
+              <w:rPr>
+                <w:sz w:val="18"/>
+              </w:rPr>
+              <w:t>2</w:t>
+            </w:r>
+          </w:p>
+        </w:tc>
+        <w:tc>
+          <w:p>
+            <w:r>
+              <w:rPr>
+                <w:sz w:val="18"/>
+              </w:rPr>
+              <w:t>superAdmin: seleciona o botão 'Create Customer'</w:t>
+            </w:r>
+          </w:p>
+        </w:tc>
+        <w:tc>
+          <w:p>
+            <w:r>
+              <w:rPr>
+                <w:sz w:val="18"/>
+              </w:rPr>
+              <w:t>SYSTEM exibe pagina com campos de cadastro de novo cliente</w:t>
+            </w:r>
+          </w:p>
+        </w:tc>
+      </w:tr>
+      <w:tr>
+        <w:tc>
+          <w:p>
+            <w:r>
+              <w:rPr>
+                <w:sz w:val="18"/>
+              </w:rPr>
+              <w:t>3</w:t>
+            </w:r>
+          </w:p>
+        </w:tc>
+        <w:tc>
+          <w:p>
+            <w:r>
+              <w:rPr>
+                <w:sz w:val="18"/>
+              </w:rPr>
+              <w:t xml:space="preserve">superAdmin: preenche corretamente os campos 'Name', 'Key File' e 'Country' e pressiona o botao 'Create' </w:t>
+            </w:r>
+          </w:p>
+        </w:tc>
+        <w:tc>
+          <w:p>
+            <w:r>
+              <w:rPr>
+                <w:sz w:val="18"/>
+              </w:rPr>
+              <w:t>SYSTEM exibe pagina com dados do novo cliente e mensagem que um novo cliente foi adicionado</w:t>
+            </w:r>
+          </w:p>
+        </w:tc>
+      </w:tr>
+      <w:tr>
+        <w:tc>
+          <w:p>
+            <w:r>
+              <w:rPr>
+                <w:sz w:val="18"/>
+              </w:rPr>
+              <w:t>4</w:t>
+            </w:r>
+          </w:p>
+        </w:tc>
+        <w:tc>
+          <w:p>
+            <w:r>
+              <w:rPr>
+                <w:sz w:val="18"/>
+              </w:rPr>
+              <w:t>superAdmin: seleciona opcao 'Customers' no menu Settings</w:t>
+            </w:r>
+          </w:p>
+        </w:tc>
+        <w:tc>
+          <w:p>
+            <w:r>
+              <w:rPr>
+                <w:sz w:val="18"/>
+              </w:rPr>
+              <w:t>SYSTEM exibe lista de clientes</w:t>
+            </w:r>
+          </w:p>
+        </w:tc>
+      </w:tr>
+      <w:tr>
+        <w:tc>
+          <w:p>
+            <w:r>
+              <w:rPr>
+                <w:sz w:val="18"/>
+              </w:rPr>
+              <w:t>5</w:t>
+            </w:r>
+          </w:p>
+        </w:tc>
+        <w:tc>
+          <w:p>
+            <w:r>
+              <w:rPr>
+                <w:sz w:val="18"/>
+              </w:rPr>
+              <w:t>superAdmin: clica no nome de um cliente</w:t>
+            </w:r>
+          </w:p>
+        </w:tc>
+        <w:tc>
+          <w:p>
+            <w:r>
+              <w:rPr>
+                <w:sz w:val="18"/>
+              </w:rPr>
+              <w:t>SYSTEM exibe dados do cliente</w:t>
+            </w:r>
+          </w:p>
+        </w:tc>
+      </w:tr>
+      <w:tr>
+        <w:tc>
+          <w:p>
+            <w:r>
+              <w:rPr>
+                <w:sz w:val="18"/>
+              </w:rPr>
+              <w:t>6</w:t>
+            </w:r>
+          </w:p>
+        </w:tc>
+        <w:tc>
+          <w:p>
+            <w:r>
+              <w:rPr>
+                <w:sz w:val="18"/>
+              </w:rPr>
+              <w:t>superAdmin: clica no botao 'Delete'</w:t>
+            </w:r>
+          </w:p>
+        </w:tc>
+        <w:tc>
+          <w:p>
+            <w:r>
+              <w:rPr>
+                <w:sz w:val="18"/>
+              </w:rPr>
+              <w:t>SYSTEM exibe mensagem solicitando confirmacao</w:t>
+            </w:r>
+          </w:p>
+        </w:tc>
+      </w:tr>
+      <w:tr>
+        <w:tc>
+          <w:p>
+            <w:r>
+              <w:rPr>
+                <w:sz w:val="18"/>
+              </w:rPr>
+              <w:t>7</w:t>
+            </w:r>
+          </w:p>
+        </w:tc>
+        <w:tc>
+          <w:p>
+            <w:r>
+              <w:rPr>
+                <w:sz w:val="18"/>
+              </w:rPr>
+              <w:t>superAdmin: pressiona o botao OK</w:t>
+            </w:r>
+          </w:p>
+        </w:tc>
+        <w:tc>
+          <w:p>
+            <w:r>
+              <w:rPr>
+                <w:sz w:val="18"/>
+              </w:rPr>
+              <w:t>SYSTEM exibe lista de clientes</w:t>
+            </w:r>
+          </w:p>
+        </w:tc>
+      </w:tr>
+      <w:tr>
+        <w:tc>
+          <w:p>
+            <w:r>
+              <w:rPr>
+                <w:sz w:val="18"/>
+              </w:rPr>
+              <w:t>8</w:t>
+            </w:r>
+          </w:p>
+        </w:tc>
+        <w:tc>
+          <w:p>
+            <w:r>
+              <w:rPr>
+                <w:sz w:val="18"/>
+              </w:rPr>
+              <w:t>superAdmin: seleciona o botão 'Create Customer'</w:t>
+            </w:r>
+          </w:p>
+        </w:tc>
+        <w:tc>
+          <w:p>
+            <w:r>
+              <w:rPr>
+                <w:sz w:val="18"/>
+              </w:rPr>
+              <w:t>SYSTEM exibe pagina com campos de cadastro de novo cliente</w:t>
+            </w:r>
+          </w:p>
+        </w:tc>
+      </w:tr>
+      <w:tr>
+        <w:tc>
+          <w:p>
+            <w:r>
+              <w:rPr>
+                <w:sz w:val="18"/>
+              </w:rPr>
+              <w:t>9</w:t>
+            </w:r>
+          </w:p>
+        </w:tc>
+        <w:tc>
+          <w:p>
+            <w:r>
+              <w:rPr>
+                <w:sz w:val="18"/>
+              </w:rPr>
+              <w:t xml:space="preserve">superAdmin: preenche corretamente os campos 'Name', 'Key File' e 'Country' e pressiona o botao 'Create' </w:t>
+            </w:r>
+          </w:p>
+        </w:tc>
+        <w:tc>
+          <w:p>
+            <w:r>
+              <w:rPr>
+                <w:sz w:val="18"/>
+              </w:rPr>
+              <w:t>SYSTEM exibe pagina com dados do novo cliente e mensagem que um novo cliente foi adicionado</w:t>
+            </w:r>
+          </w:p>
+        </w:tc>
+      </w:tr>
+      <w:tr>
+        <w:tc>
+          <w:p>
+            <w:r>
+              <w:rPr>
+                <w:sz w:val="18"/>
+              </w:rPr>
+              <w:t>10</w:t>
+            </w:r>
+          </w:p>
+        </w:tc>
+        <w:tc>
+          <w:p>
+            <w:r>
+              <w:rPr>
+                <w:sz w:val="18"/>
+              </w:rPr>
+              <w:t>superAdmin: seleciona opcao 'Customers' no menu Settings</w:t>
+            </w:r>
+          </w:p>
+        </w:tc>
+        <w:tc>
+          <w:p>
+            <w:r>
+              <w:rPr>
+                <w:sz w:val="18"/>
+              </w:rPr>
+              <w:t>SYSTEM exibe lista de clientes</w:t>
+            </w:r>
+          </w:p>
+        </w:tc>
+      </w:tr>
+      <w:tr>
+        <w:tc>
+          <w:p>
+            <w:r>
+              <w:rPr>
+                <w:sz w:val="18"/>
+              </w:rPr>
+              <w:t>11</w:t>
+            </w:r>
+          </w:p>
+        </w:tc>
+        <w:tc>
+          <w:p>
+            <w:r>
+              <w:rPr>
+                <w:sz w:val="18"/>
+              </w:rPr>
+              <w:t>superAdmin: clica no nome de um cliente</w:t>
+            </w:r>
+          </w:p>
+        </w:tc>
+        <w:tc>
+          <w:p>
+            <w:r>
+              <w:rPr>
+                <w:sz w:val="18"/>
+              </w:rPr>
+              <w:t>SYSTEM exibe dados do cliente</w:t>
+            </w:r>
+          </w:p>
+        </w:tc>
+      </w:tr>
+      <w:tr>
+        <w:tc>
+          <w:p>
+            <w:r>
+              <w:rPr>
+                <w:sz w:val="18"/>
+              </w:rPr>
+              <w:t>12</w:t>
+            </w:r>
+          </w:p>
+        </w:tc>
+        <w:tc>
+          <w:p>
+            <w:r>
+              <w:rPr>
+                <w:sz w:val="18"/>
+              </w:rPr>
+              <w:t>superAdmin: clica no botao 'Cancel'</w:t>
             </w:r>
           </w:p>
         </w:tc>

</xml_diff>

<commit_message>
feat(saff-study): publish specification and test suite v1.8
</commit_message>
<xml_diff>
--- a/output/docx/CRUDCliente.docx
+++ b/output/docx/CRUDCliente.docx
@@ -197,7 +197,7 @@
               <w:rPr>
                 <w:sz w:val="18"/>
               </w:rPr>
-              <w:t>superAdmin: seleciona opcao 'Customers' no menu Settings</w:t>
+              <w:t>superAdmin: seleciona opção 'Customers' no menu Settings</w:t>
             </w:r>
           </w:p>
         </w:tc>
@@ -239,7 +239,7 @@
               <w:rPr>
                 <w:sz w:val="18"/>
               </w:rPr>
-              <w:t>SYSTEM exibe pagina com campos de cadastro de novo cliente</w:t>
+              <w:t>SYSTEM exibe página com campos de cadastro de novo cliente</w:t>
             </w:r>
           </w:p>
         </w:tc>
@@ -261,17 +261,17 @@
               <w:rPr>
                 <w:sz w:val="18"/>
               </w:rPr>
-              <w:t xml:space="preserve">superAdmin: preenche corretamente os campos 'Name', 'Key File' e 'Country' e pressiona o botao 'Create' </w:t>
-            </w:r>
-          </w:p>
-        </w:tc>
-        <w:tc>
-          <w:p>
-            <w:r>
-              <w:rPr>
-                <w:sz w:val="18"/>
-              </w:rPr>
-              <w:t>SYSTEM exibe pagina com dados do novo cliente e mensagem que um novo cliente foi adicionado</w:t>
+              <w:t xml:space="preserve">superAdmin: preenche corretamente os campos 'Name', 'Key File' e 'Country' e pressiona o botão 'Create' </w:t>
+            </w:r>
+          </w:p>
+        </w:tc>
+        <w:tc>
+          <w:p>
+            <w:r>
+              <w:rPr>
+                <w:sz w:val="18"/>
+              </w:rPr>
+              <w:t>SYSTEM exibe página com dados do novo cliente e mensagem que um novo cliente foi adicionado</w:t>
             </w:r>
           </w:p>
         </w:tc>
@@ -293,7 +293,7 @@
               <w:rPr>
                 <w:sz w:val="18"/>
               </w:rPr>
-              <w:t>superAdmin: seleciona opcao 'Customers' no menu Settings</w:t>
+              <w:t>superAdmin: seleciona opção 'Customers' no menu Settings</w:t>
             </w:r>
           </w:p>
         </w:tc>
@@ -357,7 +357,7 @@
               <w:rPr>
                 <w:sz w:val="18"/>
               </w:rPr>
-              <w:t>superAdmin: clica no botao 'Cancel'</w:t>
+              <w:t>superAdmin: clica no botão 'Cancel'</w:t>
             </w:r>
           </w:p>
         </w:tc>
@@ -388,7 +388,7 @@
           <w:sz w:val="24"/>
           <w:color w:val="2B6CB0"/>
         </w:rPr>
-        <w:t>[TC2] Alternative Flow 1: Campo fora da formatacao esperada, e.g., 'ddd' para 'Key File'</w:t>
+        <w:t>[TC2] Alternative Flow 1: Campo fora da formatação esperada, e.g., 'ddd' para 'Key File'</w:t>
       </w:r>
     </w:p>
     <w:p>
@@ -515,7 +515,7 @@
               <w:rPr>
                 <w:sz w:val="18"/>
               </w:rPr>
-              <w:t>superAdmin: seleciona opcao 'Customers' no menu Settings</w:t>
+              <w:t>superAdmin: seleciona opção 'Customers' no menu Settings</w:t>
             </w:r>
           </w:p>
         </w:tc>
@@ -557,7 +557,7 @@
               <w:rPr>
                 <w:sz w:val="18"/>
               </w:rPr>
-              <w:t>SYSTEM exibe pagina com campos de cadastro de novo cliente</w:t>
+              <w:t>SYSTEM exibe página com campos de cadastro de novo cliente</w:t>
             </w:r>
           </w:p>
         </w:tc>
@@ -589,7 +589,7 @@
               <w:rPr>
                 <w:sz w:val="18"/>
               </w:rPr>
-              <w:t>SYSTEM exibe mensagem informando que os dados nao correspondem a formatação esperada</w:t>
+              <w:t>SYSTEM exibe mensagem informando que os dados não correspondem a formatação esperada</w:t>
             </w:r>
           </w:p>
         </w:tc>
@@ -611,17 +611,17 @@
               <w:rPr>
                 <w:sz w:val="18"/>
               </w:rPr>
-              <w:t xml:space="preserve">superAdmin: preenche corretamente os campos 'Name', 'Key File' e 'Country' e pressiona o botao 'Create' </w:t>
-            </w:r>
-          </w:p>
-        </w:tc>
-        <w:tc>
-          <w:p>
-            <w:r>
-              <w:rPr>
-                <w:sz w:val="18"/>
-              </w:rPr>
-              <w:t>SYSTEM exibe pagina com dados do novo cliente e mensagem que um novo cliente foi adicionado</w:t>
+              <w:t xml:space="preserve">superAdmin: preenche corretamente os campos 'Name', 'Key File' e 'Country' e pressiona o botão 'Create' </w:t>
+            </w:r>
+          </w:p>
+        </w:tc>
+        <w:tc>
+          <w:p>
+            <w:r>
+              <w:rPr>
+                <w:sz w:val="18"/>
+              </w:rPr>
+              <w:t>SYSTEM exibe página com dados do novo cliente e mensagem que um novo cliente foi adicionado</w:t>
             </w:r>
           </w:p>
         </w:tc>
@@ -643,7 +643,7 @@
               <w:rPr>
                 <w:sz w:val="18"/>
               </w:rPr>
-              <w:t>superAdmin: seleciona opcao 'Customers' no menu Settings</w:t>
+              <w:t>superAdmin: seleciona opção 'Customers' no menu Settings</w:t>
             </w:r>
           </w:p>
         </w:tc>
@@ -707,7 +707,7 @@
               <w:rPr>
                 <w:sz w:val="18"/>
               </w:rPr>
-              <w:t>superAdmin: clica no botao 'Cancel'</w:t>
+              <w:t>superAdmin: clica no botão 'Cancel'</w:t>
             </w:r>
           </w:p>
         </w:tc>
@@ -738,7 +738,7 @@
           <w:sz w:val="24"/>
           <w:color w:val="2B6CB0"/>
         </w:rPr>
-        <w:t>[TC3] Alternative Flow 2: Cancela criacao</w:t>
+        <w:t>[TC3] Alternative Flow 2: Cancela criação</w:t>
       </w:r>
     </w:p>
     <w:p>
@@ -865,7 +865,7 @@
               <w:rPr>
                 <w:sz w:val="18"/>
               </w:rPr>
-              <w:t>superAdmin: seleciona opcao 'Customers' no menu Settings</w:t>
+              <w:t>superAdmin: seleciona opção 'Customers' no menu Settings</w:t>
             </w:r>
           </w:p>
         </w:tc>
@@ -907,7 +907,7 @@
               <w:rPr>
                 <w:sz w:val="18"/>
               </w:rPr>
-              <w:t>SYSTEM exibe pagina com campos de cadastro de novo cliente</w:t>
+              <w:t>SYSTEM exibe página com campos de cadastro de novo cliente</w:t>
             </w:r>
           </w:p>
         </w:tc>
@@ -929,7 +929,7 @@
               <w:rPr>
                 <w:sz w:val="18"/>
               </w:rPr>
-              <w:t>superAdmin: Cancela criacao</w:t>
+              <w:t>superAdmin: Cancela criação</w:t>
             </w:r>
           </w:p>
         </w:tc>
@@ -971,7 +971,7 @@
               <w:rPr>
                 <w:sz w:val="18"/>
               </w:rPr>
-              <w:t>SYSTEM exibe pagina com campos de cadastro de novo cliente</w:t>
+              <w:t>SYSTEM exibe página com campos de cadastro de novo cliente</w:t>
             </w:r>
           </w:p>
         </w:tc>
@@ -993,17 +993,17 @@
               <w:rPr>
                 <w:sz w:val="18"/>
               </w:rPr>
-              <w:t xml:space="preserve">superAdmin: preenche corretamente os campos 'Name', 'Key File' e 'Country' e pressiona o botao 'Create' </w:t>
-            </w:r>
-          </w:p>
-        </w:tc>
-        <w:tc>
-          <w:p>
-            <w:r>
-              <w:rPr>
-                <w:sz w:val="18"/>
-              </w:rPr>
-              <w:t>SYSTEM exibe pagina com dados do novo cliente e mensagem que um novo cliente foi adicionado</w:t>
+              <w:t xml:space="preserve">superAdmin: preenche corretamente os campos 'Name', 'Key File' e 'Country' e pressiona o botão 'Create' </w:t>
+            </w:r>
+          </w:p>
+        </w:tc>
+        <w:tc>
+          <w:p>
+            <w:r>
+              <w:rPr>
+                <w:sz w:val="18"/>
+              </w:rPr>
+              <w:t>SYSTEM exibe página com dados do novo cliente e mensagem que um novo cliente foi adicionado</w:t>
             </w:r>
           </w:p>
         </w:tc>
@@ -1025,7 +1025,7 @@
               <w:rPr>
                 <w:sz w:val="18"/>
               </w:rPr>
-              <w:t>superAdmin: seleciona opcao 'Customers' no menu Settings</w:t>
+              <w:t>superAdmin: seleciona opção 'Customers' no menu Settings</w:t>
             </w:r>
           </w:p>
         </w:tc>
@@ -1089,7 +1089,7 @@
               <w:rPr>
                 <w:sz w:val="18"/>
               </w:rPr>
-              <w:t>superAdmin: clica no botao 'Cancel'</w:t>
+              <w:t>superAdmin: clica no botão 'Cancel'</w:t>
             </w:r>
           </w:p>
         </w:tc>
@@ -1247,7 +1247,7 @@
               <w:rPr>
                 <w:sz w:val="18"/>
               </w:rPr>
-              <w:t>superAdmin: seleciona opcao 'Customers' no menu Settings</w:t>
+              <w:t>superAdmin: seleciona opção 'Customers' no menu Settings</w:t>
             </w:r>
           </w:p>
         </w:tc>
@@ -1289,7 +1289,7 @@
               <w:rPr>
                 <w:sz w:val="18"/>
               </w:rPr>
-              <w:t>SYSTEM exibe pagina com campos de cadastro de novo cliente</w:t>
+              <w:t>SYSTEM exibe página com campos de cadastro de novo cliente</w:t>
             </w:r>
           </w:p>
         </w:tc>
@@ -1311,17 +1311,17 @@
               <w:rPr>
                 <w:sz w:val="18"/>
               </w:rPr>
-              <w:t xml:space="preserve">superAdmin: preenche corretamente os campos 'Name', 'Key File' e 'Country' e pressiona o botao 'Create' </w:t>
-            </w:r>
-          </w:p>
-        </w:tc>
-        <w:tc>
-          <w:p>
-            <w:r>
-              <w:rPr>
-                <w:sz w:val="18"/>
-              </w:rPr>
-              <w:t>SYSTEM exibe pagina com dados do novo cliente e mensagem que um novo cliente foi adicionado</w:t>
+              <w:t xml:space="preserve">superAdmin: preenche corretamente os campos 'Name', 'Key File' e 'Country' e pressiona o botão 'Create' </w:t>
+            </w:r>
+          </w:p>
+        </w:tc>
+        <w:tc>
+          <w:p>
+            <w:r>
+              <w:rPr>
+                <w:sz w:val="18"/>
+              </w:rPr>
+              <w:t>SYSTEM exibe página com dados do novo cliente e mensagem que um novo cliente foi adicionado</w:t>
             </w:r>
           </w:p>
         </w:tc>
@@ -1343,7 +1343,7 @@
               <w:rPr>
                 <w:sz w:val="18"/>
               </w:rPr>
-              <w:t>superAdmin: seleciona opcao 'Customers' no menu Settings</w:t>
+              <w:t>superAdmin: seleciona opção 'Customers' no menu Settings</w:t>
             </w:r>
           </w:p>
         </w:tc>
@@ -1407,7 +1407,7 @@
               <w:rPr>
                 <w:sz w:val="18"/>
               </w:rPr>
-              <w:t>superAdmin: clica no botao 'Edit'</w:t>
+              <w:t>superAdmin: clica no botão 'Edit'</w:t>
             </w:r>
           </w:p>
         </w:tc>
@@ -1439,7 +1439,7 @@
               <w:rPr>
                 <w:sz w:val="18"/>
               </w:rPr>
-              <w:t>superAdmin: preenche os novos valores e pressiona o botao 'Update</w:t>
+              <w:t>superAdmin: preenche os novos valores e pressiona o botão 'Update</w:t>
             </w:r>
           </w:p>
         </w:tc>
@@ -1481,7 +1481,7 @@
               <w:rPr>
                 <w:sz w:val="18"/>
               </w:rPr>
-              <w:t>SYSTEM exibe pagina com campos de cadastro de novo cliente</w:t>
+              <w:t>SYSTEM exibe página com campos de cadastro de novo cliente</w:t>
             </w:r>
           </w:p>
         </w:tc>
@@ -1503,17 +1503,17 @@
               <w:rPr>
                 <w:sz w:val="18"/>
               </w:rPr>
-              <w:t xml:space="preserve">superAdmin: preenche corretamente os campos 'Name', 'Key File' e 'Country' e pressiona o botao 'Create' </w:t>
-            </w:r>
-          </w:p>
-        </w:tc>
-        <w:tc>
-          <w:p>
-            <w:r>
-              <w:rPr>
-                <w:sz w:val="18"/>
-              </w:rPr>
-              <w:t>SYSTEM exibe pagina com dados do novo cliente e mensagem que um novo cliente foi adicionado</w:t>
+              <w:t xml:space="preserve">superAdmin: preenche corretamente os campos 'Name', 'Key File' e 'Country' e pressiona o botão 'Create' </w:t>
+            </w:r>
+          </w:p>
+        </w:tc>
+        <w:tc>
+          <w:p>
+            <w:r>
+              <w:rPr>
+                <w:sz w:val="18"/>
+              </w:rPr>
+              <w:t>SYSTEM exibe página com dados do novo cliente e mensagem que um novo cliente foi adicionado</w:t>
             </w:r>
           </w:p>
         </w:tc>
@@ -1535,7 +1535,7 @@
               <w:rPr>
                 <w:sz w:val="18"/>
               </w:rPr>
-              <w:t>superAdmin: seleciona opcao 'Customers' no menu Settings</w:t>
+              <w:t>superAdmin: seleciona opção 'Customers' no menu Settings</w:t>
             </w:r>
           </w:p>
         </w:tc>
@@ -1599,7 +1599,7 @@
               <w:rPr>
                 <w:sz w:val="18"/>
               </w:rPr>
-              <w:t>superAdmin: clica no botao 'Cancel'</w:t>
+              <w:t>superAdmin: clica no botão 'Cancel'</w:t>
             </w:r>
           </w:p>
         </w:tc>
@@ -1757,7 +1757,7 @@
               <w:rPr>
                 <w:sz w:val="18"/>
               </w:rPr>
-              <w:t>superAdmin: seleciona opcao 'Customers' no menu Settings</w:t>
+              <w:t>superAdmin: seleciona opção 'Customers' no menu Settings</w:t>
             </w:r>
           </w:p>
         </w:tc>
@@ -1799,7 +1799,7 @@
               <w:rPr>
                 <w:sz w:val="18"/>
               </w:rPr>
-              <w:t>SYSTEM exibe pagina com campos de cadastro de novo cliente</w:t>
+              <w:t>SYSTEM exibe página com campos de cadastro de novo cliente</w:t>
             </w:r>
           </w:p>
         </w:tc>
@@ -1821,17 +1821,17 @@
               <w:rPr>
                 <w:sz w:val="18"/>
               </w:rPr>
-              <w:t xml:space="preserve">superAdmin: preenche corretamente os campos 'Name', 'Key File' e 'Country' e pressiona o botao 'Create' </w:t>
-            </w:r>
-          </w:p>
-        </w:tc>
-        <w:tc>
-          <w:p>
-            <w:r>
-              <w:rPr>
-                <w:sz w:val="18"/>
-              </w:rPr>
-              <w:t>SYSTEM exibe pagina com dados do novo cliente e mensagem que um novo cliente foi adicionado</w:t>
+              <w:t xml:space="preserve">superAdmin: preenche corretamente os campos 'Name', 'Key File' e 'Country' e pressiona o botão 'Create' </w:t>
+            </w:r>
+          </w:p>
+        </w:tc>
+        <w:tc>
+          <w:p>
+            <w:r>
+              <w:rPr>
+                <w:sz w:val="18"/>
+              </w:rPr>
+              <w:t>SYSTEM exibe página com dados do novo cliente e mensagem que um novo cliente foi adicionado</w:t>
             </w:r>
           </w:p>
         </w:tc>
@@ -1853,7 +1853,7 @@
               <w:rPr>
                 <w:sz w:val="18"/>
               </w:rPr>
-              <w:t>superAdmin: seleciona opcao 'Customers' no menu Settings</w:t>
+              <w:t>superAdmin: seleciona opção 'Customers' no menu Settings</w:t>
             </w:r>
           </w:p>
         </w:tc>
@@ -1917,17 +1917,17 @@
               <w:rPr>
                 <w:sz w:val="18"/>
               </w:rPr>
-              <w:t>superAdmin: clica no botao 'Delete'</w:t>
-            </w:r>
-          </w:p>
-        </w:tc>
-        <w:tc>
-          <w:p>
-            <w:r>
-              <w:rPr>
-                <w:sz w:val="18"/>
-              </w:rPr>
-              <w:t>SYSTEM exibe mensagem solicitando confirmacao</w:t>
+              <w:t>superAdmin: clica no botão 'Delete'</w:t>
+            </w:r>
+          </w:p>
+        </w:tc>
+        <w:tc>
+          <w:p>
+            <w:r>
+              <w:rPr>
+                <w:sz w:val="18"/>
+              </w:rPr>
+              <w:t>SYSTEM exibe mensagem solicitando confirmação</w:t>
             </w:r>
           </w:p>
         </w:tc>
@@ -1991,7 +1991,7 @@
               <w:rPr>
                 <w:sz w:val="18"/>
               </w:rPr>
-              <w:t>SYSTEM exibe pagina com campos de cadastro de novo cliente</w:t>
+              <w:t>SYSTEM exibe página com campos de cadastro de novo cliente</w:t>
             </w:r>
           </w:p>
         </w:tc>
@@ -2013,17 +2013,17 @@
               <w:rPr>
                 <w:sz w:val="18"/>
               </w:rPr>
-              <w:t xml:space="preserve">superAdmin: preenche corretamente os campos 'Name', 'Key File' e 'Country' e pressiona o botao 'Create' </w:t>
-            </w:r>
-          </w:p>
-        </w:tc>
-        <w:tc>
-          <w:p>
-            <w:r>
-              <w:rPr>
-                <w:sz w:val="18"/>
-              </w:rPr>
-              <w:t>SYSTEM exibe pagina com dados do novo cliente e mensagem que um novo cliente foi adicionado</w:t>
+              <w:t xml:space="preserve">superAdmin: preenche corretamente os campos 'Name', 'Key File' e 'Country' e pressiona o botão 'Create' </w:t>
+            </w:r>
+          </w:p>
+        </w:tc>
+        <w:tc>
+          <w:p>
+            <w:r>
+              <w:rPr>
+                <w:sz w:val="18"/>
+              </w:rPr>
+              <w:t>SYSTEM exibe página com dados do novo cliente e mensagem que um novo cliente foi adicionado</w:t>
             </w:r>
           </w:p>
         </w:tc>
@@ -2045,7 +2045,7 @@
               <w:rPr>
                 <w:sz w:val="18"/>
               </w:rPr>
-              <w:t>superAdmin: seleciona opcao 'Customers' no menu Settings</w:t>
+              <w:t>superAdmin: seleciona opção 'Customers' no menu Settings</w:t>
             </w:r>
           </w:p>
         </w:tc>
@@ -2109,7 +2109,7 @@
               <w:rPr>
                 <w:sz w:val="18"/>
               </w:rPr>
-              <w:t>superAdmin: clica no botao 'Cancel'</w:t>
+              <w:t>superAdmin: clica no botão 'Cancel'</w:t>
             </w:r>
           </w:p>
         </w:tc>

</xml_diff>

<commit_message>
feat(saff-study): publish specification and test suite v2.2
</commit_message>
<xml_diff>
--- a/output/docx/CRUDCliente.docx
+++ b/output/docx/CRUDCliente.docx
@@ -229,7 +229,7 @@
               <w:rPr>
                 <w:sz w:val="18"/>
               </w:rPr>
-              <w:t>superAdmin: seleciona o botão 'Create Customer'</w:t>
+              <w:t>superAdmin: seleciona o botão 'Create Customer', situado no lado direito inferior da tela</w:t>
             </w:r>
           </w:p>
         </w:tc>
@@ -547,7 +547,7 @@
               <w:rPr>
                 <w:sz w:val="18"/>
               </w:rPr>
-              <w:t>superAdmin: seleciona o botão 'Create Customer'</w:t>
+              <w:t>superAdmin: seleciona o botão 'Create Customer', situado no lado direito inferior da tela</w:t>
             </w:r>
           </w:p>
         </w:tc>
@@ -897,7 +897,7 @@
               <w:rPr>
                 <w:sz w:val="18"/>
               </w:rPr>
-              <w:t>superAdmin: seleciona o botão 'Create Customer'</w:t>
+              <w:t>superAdmin: seleciona o botão 'Create Customer', situado no lado direito inferior da tela</w:t>
             </w:r>
           </w:p>
         </w:tc>
@@ -961,7 +961,7 @@
               <w:rPr>
                 <w:sz w:val="18"/>
               </w:rPr>
-              <w:t>superAdmin: seleciona o botão 'Create Customer'</w:t>
+              <w:t>superAdmin: seleciona o botão 'Create Customer', situado no lado direito inferior da tela</w:t>
             </w:r>
           </w:p>
         </w:tc>
@@ -1279,7 +1279,7 @@
               <w:rPr>
                 <w:sz w:val="18"/>
               </w:rPr>
-              <w:t>superAdmin: seleciona o botão 'Create Customer'</w:t>
+              <w:t>superAdmin: seleciona o botão 'Create Customer', situado no lado direito inferior da tela</w:t>
             </w:r>
           </w:p>
         </w:tc>
@@ -1471,7 +1471,7 @@
               <w:rPr>
                 <w:sz w:val="18"/>
               </w:rPr>
-              <w:t>superAdmin: seleciona o botão 'Create Customer'</w:t>
+              <w:t>superAdmin: seleciona o botão 'Create Customer', situado no lado direito inferior da tela</w:t>
             </w:r>
           </w:p>
         </w:tc>
@@ -1789,7 +1789,7 @@
               <w:rPr>
                 <w:sz w:val="18"/>
               </w:rPr>
-              <w:t>superAdmin: seleciona o botão 'Create Customer'</w:t>
+              <w:t>superAdmin: seleciona o botão 'Create Customer', situado no lado direito inferior da tela</w:t>
             </w:r>
           </w:p>
         </w:tc>
@@ -1981,7 +1981,7 @@
               <w:rPr>
                 <w:sz w:val="18"/>
               </w:rPr>
-              <w:t>superAdmin: seleciona o botão 'Create Customer'</w:t>
+              <w:t>superAdmin: seleciona o botão 'Create Customer', situado no lado direito inferior da tela</w:t>
             </w:r>
           </w:p>
         </w:tc>

</xml_diff>